<commit_message>
Search for tungsten and other impurities: W I only with the hot cathode; Mn, Cr, Fe, Sr, Ca, Al
lines_final.md part 2, 2.1; guide 3.5 (how to search for an impurity with a
control); NIST Sr I / Sr II tables.

Co-Authored-By: Claude Opus 5.5 <noreply@anthropic.com>
Claude-Session: https://claude.ai/code/session_018nKkrJu4ehWWcEHTugH1GR
</commit_message>
<xml_diff>
--- a/docs/crm/guide_calibration_and_lines.docx
+++ b/docs/crm/guide_calibration_and_lines.docx
@@ -2,7 +2,7 @@
 <file path=word/document.xml><?xml version="1.0" encoding="utf-8"?>
 <w:document xmlns:w="http://schemas.openxmlformats.org/wordprocessingml/2006/main" xmlns:m="http://schemas.openxmlformats.org/officeDocument/2006/math" xmlns:r="http://schemas.openxmlformats.org/officeDocument/2006/relationships" xmlns:o="urn:schemas-microsoft-com:office:office" xmlns:v="urn:schemas-microsoft-com:vml" xmlns:w10="urn:schemas-microsoft-com:office:word" xmlns:a="http://schemas.openxmlformats.org/drawingml/2006/main" xmlns:pic="http://schemas.openxmlformats.org/drawingml/2006/picture" xmlns:wp="http://schemas.openxmlformats.org/drawingml/2006/wordprocessingDrawing">
   <w:body>
-    <w:bookmarkStart w:id="22" w:name="X4f4c0bb8865781a04931e01e48432a164bddb05"/>
+    <w:bookmarkStart w:id="23" w:name="X4f4c0bb8865781a04931e01e48432a164bddb05"/>
     <w:p>
       <w:pPr>
         <w:pStyle w:val="Heading1"/>
@@ -3205,7 +3205,7 @@
     </w:p>
     <w:bookmarkEnd w:id="15"/>
     <w:bookmarkEnd w:id="16"/>
-    <w:bookmarkStart w:id="21" w:name="X0ecbf2ffb420b703ceff1cf4fc8cccea1ce07db"/>
+    <w:bookmarkStart w:id="22" w:name="X0ecbf2ffb420b703ceff1cf4fc8cccea1ce07db"/>
     <w:p>
       <w:pPr>
         <w:pStyle w:val="Heading2"/>
@@ -4045,8 +4045,212 @@
       </w:r>
     </w:p>
     <w:bookmarkEnd w:id="20"/>
+    <w:bookmarkStart w:id="21" w:name="Xdb8a796219d7bb02785880e0b399944d100625f"/>
+    <w:p>
+      <w:pPr>
+        <w:pStyle w:val="Heading3"/>
+      </w:pPr>
+      <w:r>
+        <w:t xml:space="preserve">3.5. Как искать линии примеси (на примере вольфрама)</w:t>
+      </w:r>
+    </w:p>
+    <w:p>
+      <w:pPr>
+        <w:pStyle w:val="Compact"/>
+        <w:numPr>
+          <w:ilvl w:val="0"/>
+          <w:numId w:val="1020"/>
+        </w:numPr>
+      </w:pPr>
+      <w:r>
+        <w:t xml:space="preserve">Возьмите линии элемента из NIST и оставьте те, что дальше 2 FWHM (49 пм) от линий Xe и</w:t>
+      </w:r>
+      <w:r>
+        <w:t xml:space="preserve"> </w:t>
+      </w:r>
+      <w:r>
+        <w:t xml:space="preserve">Ba. Шкала λ должна быть исправлена (п. 1).</w:t>
+      </w:r>
+    </w:p>
+    <w:p>
+      <w:pPr>
+        <w:pStyle w:val="Compact"/>
+        <w:numPr>
+          <w:ilvl w:val="0"/>
+          <w:numId w:val="1020"/>
+        </w:numPr>
+      </w:pPr>
+      <w:r>
+        <w:t xml:space="preserve">Для каждой измерьте пик</w:t>
+      </w:r>
+      <w:r>
+        <w:t xml:space="preserve"> </w:t>
+      </w:r>
+      <w:r>
+        <w:rPr>
+          <w:b/>
+          <w:bCs/>
+        </w:rPr>
+        <w:t xml:space="preserve">точно на своём месте</w:t>
+      </w:r>
+      <w:r>
+        <w:t xml:space="preserve"> </w:t>
+      </w:r>
+      <w:r>
+        <w:t xml:space="preserve">(центр в ±8–12 пм), ширину и S/N.</w:t>
+      </w:r>
+      <w:r>
+        <w:t xml:space="preserve"> </w:t>
+      </w:r>
+      <w:r>
+        <w:t xml:space="preserve">«Есть» — S/N ≥ 5, ширина 15–39 пм, центр в допуске.</w:t>
+      </w:r>
+    </w:p>
+    <w:p>
+      <w:pPr>
+        <w:pStyle w:val="Compact"/>
+        <w:numPr>
+          <w:ilvl w:val="0"/>
+          <w:numId w:val="1020"/>
+        </w:numPr>
+      </w:pPr>
+      <w:r>
+        <w:rPr>
+          <w:b/>
+          <w:bCs/>
+        </w:rPr>
+        <w:t xml:space="preserve">Контроль:</w:t>
+      </w:r>
+      <w:r>
+        <w:t xml:space="preserve"> </w:t>
+      </w:r>
+      <w:r>
+        <w:t xml:space="preserve">повторите то же на длинах волн, сдвинутых на 0.2–0.6 нм (там, где по NIST</w:t>
+      </w:r>
+      <w:r>
+        <w:t xml:space="preserve"> </w:t>
+      </w:r>
+      <w:r>
+        <w:t xml:space="preserve">ничего нет). Доля «найденных» на настоящих линиях должна быть заметно больше, чем на</w:t>
+      </w:r>
+      <w:r>
+        <w:t xml:space="preserve"> </w:t>
+      </w:r>
+      <w:r>
+        <w:t xml:space="preserve">контрольных, иначе это случайные совпадения с неизвестными линиями Xe.</w:t>
+      </w:r>
+    </w:p>
+    <w:p>
+      <w:pPr>
+        <w:pStyle w:val="Compact"/>
+        <w:numPr>
+          <w:ilvl w:val="0"/>
+          <w:numId w:val="1020"/>
+        </w:numPr>
+      </w:pPr>
+      <w:r>
+        <w:rPr>
+          <w:b/>
+          <w:bCs/>
+        </w:rPr>
+        <w:t xml:space="preserve">Согласованность:</w:t>
+      </w:r>
+      <w:r>
+        <w:t xml:space="preserve"> </w:t>
+      </w:r>
+      <w:r>
+        <w:t xml:space="preserve">сравните найденные линии с ожидаемой яркостью g·A·exp(−E_k/T) (g, A,</w:t>
+      </w:r>
+      <w:r>
+        <w:t xml:space="preserve"> </w:t>
+      </w:r>
+      <w:r>
+        <w:t xml:space="preserve">E_k из NIST). Если найдена слабая по расчёту линия, а сильная — нет, это не тот элемент.</w:t>
+      </w:r>
+    </w:p>
+    <w:p>
+      <w:pPr>
+        <w:pStyle w:val="Compact"/>
+        <w:numPr>
+          <w:ilvl w:val="0"/>
+          <w:numId w:val="1020"/>
+        </w:numPr>
+      </w:pPr>
+      <w:r>
+        <w:rPr>
+          <w:b/>
+          <w:bCs/>
+        </w:rPr>
+        <w:t xml:space="preserve">Поведение между спектрами:</w:t>
+      </w:r>
+      <w:r>
+        <w:t xml:space="preserve"> </w:t>
+      </w:r>
+      <w:r>
+        <w:t xml:space="preserve">линии одного элемента растут и падают вместе; сравните</w:t>
+      </w:r>
+      <w:r>
+        <w:t xml:space="preserve"> </w:t>
+      </w:r>
+      <w:r>
+        <w:t xml:space="preserve">спектры с разным режимом (у нас: с горячим катодом и без).</w:t>
+      </w:r>
+    </w:p>
+    <w:p>
+      <w:pPr>
+        <w:pStyle w:val="Compact"/>
+        <w:numPr>
+          <w:ilvl w:val="0"/>
+          <w:numId w:val="1020"/>
+        </w:numPr>
+      </w:pPr>
+      <w:r>
+        <w:rPr>
+          <w:b/>
+          <w:bCs/>
+        </w:rPr>
+        <w:t xml:space="preserve">Соседи других элементов:</w:t>
+      </w:r>
+      <w:r>
+        <w:t xml:space="preserve"> </w:t>
+      </w:r>
+      <w:r>
+        <w:t xml:space="preserve">у каждой найденной линии проверьте линии всех правдоподобных</w:t>
+      </w:r>
+      <w:r>
+        <w:t xml:space="preserve"> </w:t>
+      </w:r>
+      <w:r>
+        <w:t xml:space="preserve">элементов в ±50 пм (NIST). Отбросить соседа можно, если сильнейшие линии его элемента в</w:t>
+      </w:r>
+      <w:r>
+        <w:t xml:space="preserve"> </w:t>
+      </w:r>
+      <w:r>
+        <w:t xml:space="preserve">спектре не видны.</w:t>
+      </w:r>
+    </w:p>
+    <w:p>
+      <w:pPr>
+        <w:pStyle w:val="Compact"/>
+        <w:numPr>
+          <w:ilvl w:val="0"/>
+          <w:numId w:val="1020"/>
+        </w:numPr>
+      </w:pPr>
+      <w:r>
+        <w:t xml:space="preserve">Если в одном куске спектра все найденные линии (разных элементов) смещены одинаково —</w:t>
+      </w:r>
+      <w:r>
+        <w:t xml:space="preserve"> </w:t>
+      </w:r>
+      <w:r>
+        <w:t xml:space="preserve">это ошибка поправки шкалы в этом куске, а не признак чужой линии.</w:t>
+      </w:r>
+    </w:p>
     <w:bookmarkEnd w:id="21"/>
     <w:bookmarkEnd w:id="22"/>
+    <w:bookmarkEnd w:id="23"/>
     <w:sectPr>
       <w:footnotePr>
         <w:numRestart w:val="eachSect"/>
@@ -4626,6 +4830,36 @@
   </w:num>
   <w:num w:numId="1019">
     <w:abstractNumId w:val="991"/>
+  </w:num>
+  <w:num w:numId="1020">
+    <w:abstractNumId w:val="99411"/>
+    <w:lvlOverride w:ilvl="0">
+      <w:startOverride w:val="1"/>
+    </w:lvlOverride>
+    <w:lvlOverride w:ilvl="1">
+      <w:startOverride w:val="1"/>
+    </w:lvlOverride>
+    <w:lvlOverride w:ilvl="2">
+      <w:startOverride w:val="1"/>
+    </w:lvlOverride>
+    <w:lvlOverride w:ilvl="3">
+      <w:startOverride w:val="1"/>
+    </w:lvlOverride>
+    <w:lvlOverride w:ilvl="4">
+      <w:startOverride w:val="1"/>
+    </w:lvlOverride>
+    <w:lvlOverride w:ilvl="5">
+      <w:startOverride w:val="1"/>
+    </w:lvlOverride>
+    <w:lvlOverride w:ilvl="6">
+      <w:startOverride w:val="1"/>
+    </w:lvlOverride>
+    <w:lvlOverride w:ilvl="7">
+      <w:startOverride w:val="1"/>
+    </w:lvlOverride>
+    <w:lvlOverride w:ilvl="8">
+      <w:startOverride w:val="1"/>
+    </w:lvlOverride>
   </w:num>
 </w:numbering>
 </file>

</xml_diff>